<commit_message>
Verplaatsen naar submappen, verbeterde dropdown met hiërarchie
</commit_message>
<xml_diff>
--- a/Aantekeningen MySolido.docx
+++ b/Aantekeningen MySolido.docx
@@ -8,6 +8,7 @@
         <w:rPr>
           <w:b/>
           <w:u w:val="single"/>
+          <w:lang w:val="en-GB"/>
         </w:rPr>
       </w:pPr>
       <w:proofErr w:type="spellStart"/>
@@ -15,6 +16,7 @@
         <w:rPr>
           <w:b/>
           <w:u w:val="single"/>
+          <w:lang w:val="en-GB"/>
         </w:rPr>
         <w:t>Aantekeningen</w:t>
       </w:r>
@@ -23,6 +25,7 @@
         <w:rPr>
           <w:b/>
           <w:u w:val="single"/>
+          <w:lang w:val="en-GB"/>
         </w:rPr>
         <w:t xml:space="preserve"> </w:t>
       </w:r>
@@ -31,6 +34,7 @@
         <w:rPr>
           <w:b/>
           <w:u w:val="single"/>
+          <w:lang w:val="en-GB"/>
         </w:rPr>
         <w:t>MySolido</w:t>
       </w:r>
@@ -236,6 +240,26 @@
       </w:pPr>
       <w:r>
         <w:rPr>
+          <w:b/>
+          <w:lang w:val="en-GB"/>
+        </w:rPr>
+        <w:t>Terminal 1</w:t>
+      </w:r>
+      <w:r>
+        <w:rPr>
+          <w:lang w:val="en-GB"/>
+        </w:rPr>
+        <w:t xml:space="preserve"> </w:t>
+      </w:r>
+    </w:p>
+    <w:p>
+      <w:pPr>
+        <w:rPr>
+          <w:lang w:val="en-GB"/>
+        </w:rPr>
+      </w:pPr>
+      <w:r>
+        <w:rPr>
           <w:lang w:val="en-GB"/>
         </w:rPr>
         <w:t>cd /c/Users/Wim/</w:t>
@@ -255,9 +279,45 @@
           <w:lang w:val="en-GB"/>
         </w:rPr>
       </w:pPr>
-      <w:proofErr w:type="spellStart"/>
-      <w:r>
-        <w:rPr>
+      <w:r>
+        <w:rPr>
+          <w:b/>
+          <w:lang w:val="en-GB"/>
+        </w:rPr>
+        <w:t>Terminal 2</w:t>
+      </w:r>
+      <w:r>
+        <w:rPr>
+          <w:lang w:val="en-GB"/>
+        </w:rPr>
+        <w:t xml:space="preserve"> </w:t>
+      </w:r>
+    </w:p>
+    <w:p>
+      <w:pPr>
+        <w:rPr>
+          <w:b/>
+          <w:lang w:val="en-GB"/>
+        </w:rPr>
+      </w:pPr>
+      <w:r>
+        <w:rPr>
+          <w:b/>
+          <w:lang w:val="en-GB"/>
+        </w:rPr>
+        <w:t>cd /c/Users/Wim/</w:t>
+      </w:r>
+      <w:proofErr w:type="spellStart"/>
+      <w:r>
+        <w:rPr>
+          <w:b/>
+          <w:lang w:val="en-GB"/>
+        </w:rPr>
+        <w:t>mysolido</w:t>
+      </w:r>
+      <w:r>
+        <w:rPr>
+          <w:b/>
           <w:lang w:val="en-GB"/>
         </w:rPr>
         <w:t>npx</w:t>
@@ -265,6 +325,7 @@
       <w:proofErr w:type="spellEnd"/>
       <w:r>
         <w:rPr>
+          <w:b/>
           <w:lang w:val="en-GB"/>
         </w:rPr>
         <w:t xml:space="preserve"> @solid/community-server -p 3000 -f .data/ -c @</w:t>
@@ -272,6 +333,7 @@
       <w:proofErr w:type="spellStart"/>
       <w:r>
         <w:rPr>
+          <w:b/>
           <w:lang w:val="en-GB"/>
         </w:rPr>
         <w:t>css:config</w:t>
@@ -279,6 +341,7 @@
       <w:proofErr w:type="spellEnd"/>
       <w:r>
         <w:rPr>
+          <w:b/>
           <w:lang w:val="en-GB"/>
         </w:rPr>
         <w:t>/</w:t>
@@ -286,6 +349,7 @@
       <w:proofErr w:type="spellStart"/>
       <w:r>
         <w:rPr>
+          <w:b/>
           <w:lang w:val="en-GB"/>
         </w:rPr>
         <w:t>file.json</w:t>
@@ -295,29 +359,225 @@
     <w:p>
       <w:pPr>
         <w:rPr>
-          <w:lang w:val="nl-NL"/>
-        </w:rPr>
-      </w:pPr>
-      <w:r>
-        <w:rPr>
-          <w:lang w:val="nl-NL"/>
-        </w:rPr>
-        <w:t>CSS_PASSWORD = '</w:t>
-      </w:r>
-      <w:r>
-        <w:rPr>
-          <w:lang w:val="nl-NL"/>
-        </w:rPr>
-        <w:t>MeVD@G9NTi&gt;4,eG</w:t>
-      </w:r>
-      <w:r>
-        <w:rPr>
-          <w:lang w:val="nl-NL"/>
-        </w:rPr>
-        <w:t xml:space="preserve">'  </w:t>
-      </w:r>
+          <w:lang w:val="en-GB"/>
+        </w:rPr>
+      </w:pPr>
       <w:bookmarkStart w:id="0" w:name="_GoBack"/>
       <w:bookmarkEnd w:id="0"/>
+      <w:r>
+        <w:rPr>
+          <w:lang w:val="en-GB"/>
+        </w:rPr>
+        <w:t xml:space="preserve">r = </w:t>
+      </w:r>
+      <w:proofErr w:type="spellStart"/>
+      <w:r>
+        <w:rPr>
+          <w:lang w:val="en-GB"/>
+        </w:rPr>
+        <w:t>requests.post</w:t>
+      </w:r>
+      <w:proofErr w:type="spellEnd"/>
+      <w:r>
+        <w:rPr>
+          <w:lang w:val="en-GB"/>
+        </w:rPr>
+        <w:t>('http://localhost:3000/.account/login/password/', json={'email':'wim.snoeren@me.com','password':'MeVD@G9NTi&gt;4,eG'})</w:t>
+      </w:r>
+    </w:p>
+    <w:p>
+      <w:proofErr w:type="spellStart"/>
+      <w:r>
+        <w:t>print</w:t>
+      </w:r>
+      <w:proofErr w:type="spellEnd"/>
+      <w:r>
+        <w:t>(</w:t>
+      </w:r>
+      <w:proofErr w:type="spellStart"/>
+      <w:r>
+        <w:t>r.status_code</w:t>
+      </w:r>
+      <w:proofErr w:type="spellEnd"/>
+      <w:r>
+        <w:t>)</w:t>
+      </w:r>
+    </w:p>
+    <w:p>
+      <w:proofErr w:type="spellStart"/>
+      <w:r>
+        <w:t>print</w:t>
+      </w:r>
+      <w:proofErr w:type="spellEnd"/>
+      <w:r>
+        <w:t>(</w:t>
+      </w:r>
+      <w:proofErr w:type="spellStart"/>
+      <w:r>
+        <w:t>r.text</w:t>
+      </w:r>
+      <w:proofErr w:type="spellEnd"/>
+      <w:r>
+        <w:t>[:200])</w:t>
+      </w:r>
+    </w:p>
+    <w:p>
+      <w:pPr>
+        <w:rPr>
+          <w:lang w:val="en-GB"/>
+        </w:rPr>
+      </w:pPr>
+      <w:r>
+        <w:rPr>
+          <w:lang w:val="en-GB"/>
+        </w:rPr>
+        <w:t>"</w:t>
+      </w:r>
+    </w:p>
+    <w:p>
+      <w:pPr>
+        <w:rPr>
+          <w:lang w:val="en-GB"/>
+        </w:rPr>
+      </w:pPr>
+      <w:r>
+        <w:rPr>
+          <w:lang w:val="en-GB"/>
+        </w:rPr>
+        <w:t>CSS_PASSWORD =</w:t>
+      </w:r>
+      <w:r>
+        <w:rPr>
+          <w:lang w:val="en-GB"/>
+        </w:rPr>
+        <w:t xml:space="preserve"> </w:t>
+      </w:r>
+      <w:r>
+        <w:rPr>
+          <w:lang w:val="en-GB"/>
+        </w:rPr>
+        <w:t>MeVD@G9NTi&gt;4,eG</w:t>
+      </w:r>
+      <w:r>
+        <w:rPr>
+          <w:lang w:val="en-GB"/>
+        </w:rPr>
+        <w:t xml:space="preserve">  </w:t>
+      </w:r>
+    </w:p>
+    <w:p>
+      <w:pPr>
+        <w:rPr>
+          <w:lang w:val="en-GB"/>
+        </w:rPr>
+      </w:pPr>
+      <w:r>
+        <w:rPr>
+          <w:lang w:val="en-GB"/>
+        </w:rPr>
+        <w:t>python -c "</w:t>
+      </w:r>
+    </w:p>
+    <w:p>
+      <w:pPr>
+        <w:rPr>
+          <w:lang w:val="en-GB"/>
+        </w:rPr>
+      </w:pPr>
+      <w:r>
+        <w:rPr>
+          <w:lang w:val="en-GB"/>
+        </w:rPr>
+        <w:t>import requests</w:t>
+      </w:r>
+    </w:p>
+    <w:p>
+      <w:pPr>
+        <w:rPr>
+          <w:lang w:val="en-GB"/>
+        </w:rPr>
+      </w:pPr>
+      <w:r>
+        <w:rPr>
+          <w:lang w:val="en-GB"/>
+        </w:rPr>
+        <w:t xml:space="preserve">r = </w:t>
+      </w:r>
+      <w:proofErr w:type="spellStart"/>
+      <w:r>
+        <w:rPr>
+          <w:lang w:val="en-GB"/>
+        </w:rPr>
+        <w:t>requests.post</w:t>
+      </w:r>
+      <w:proofErr w:type="spellEnd"/>
+      <w:r>
+        <w:rPr>
+          <w:lang w:val="en-GB"/>
+        </w:rPr>
+        <w:t>('http://localhost:3000/.account/login/password/', json={'email':'wim.snoeren@me.com','password':'MeVD@G9NTi&gt;4</w:t>
+      </w:r>
+      <w:r>
+        <w:rPr>
+          <w:lang w:val="en-GB"/>
+        </w:rPr>
+        <w:t>,eG</w:t>
+      </w:r>
+      <w:r>
+        <w:rPr>
+          <w:lang w:val="en-GB"/>
+        </w:rPr>
+        <w:t>'})</w:t>
+      </w:r>
+    </w:p>
+    <w:p>
+      <w:proofErr w:type="spellStart"/>
+      <w:r>
+        <w:t>print</w:t>
+      </w:r>
+      <w:proofErr w:type="spellEnd"/>
+      <w:r>
+        <w:t>(</w:t>
+      </w:r>
+      <w:proofErr w:type="spellStart"/>
+      <w:r>
+        <w:t>r.status_code</w:t>
+      </w:r>
+      <w:proofErr w:type="spellEnd"/>
+      <w:r>
+        <w:t>)</w:t>
+      </w:r>
+    </w:p>
+    <w:p>
+      <w:proofErr w:type="spellStart"/>
+      <w:r>
+        <w:t>print</w:t>
+      </w:r>
+      <w:proofErr w:type="spellEnd"/>
+      <w:r>
+        <w:t>(</w:t>
+      </w:r>
+      <w:proofErr w:type="spellStart"/>
+      <w:r>
+        <w:t>r.text</w:t>
+      </w:r>
+      <w:proofErr w:type="spellEnd"/>
+      <w:r>
+        <w:t>[:200])</w:t>
+      </w:r>
+    </w:p>
+    <w:p>
+      <w:pPr>
+        <w:rPr>
+          <w:lang w:val="nl-NL"/>
+        </w:rPr>
+      </w:pPr>
+      <w:r>
+        <w:rPr>
+          <w:lang w:val="nl-NL"/>
+        </w:rPr>
+        <w:t>"</w:t>
+      </w:r>
     </w:p>
     <w:sectPr>
       <w:pgSz w:w="11906" w:h="16838"/>

</xml_diff>